<commit_message>
new instuctor postion under experince
</commit_message>
<xml_diff>
--- a/Resume/Data Science/DataScienceResume.docx
+++ b/Resume/Data Science/DataScienceResume.docx
@@ -10259,10 +10259,21 @@
 </file>
 
 <file path=customXml/item1.xml><?xml version="1.0" encoding="utf-8"?>
+<p:properties xmlns:p="http://schemas.microsoft.com/office/2006/metadata/properties" xmlns:xsi="http://www.w3.org/2001/XMLSchema-instance" xmlns:pc="http://schemas.microsoft.com/office/infopath/2007/PartnerControls">
+  <documentManagement>
+    <TaxCatchAll xmlns="2da6bad5-2be1-4928-81ee-00c79ada373c" xsi:nil="true"/>
+    <lcf76f155ced4ddcb4097134ff3c332f xmlns="dd5b41f2-47a1-4d36-976d-562f279d384a">
+      <Terms xmlns="http://schemas.microsoft.com/office/infopath/2007/PartnerControls"/>
+    </lcf76f155ced4ddcb4097134ff3c332f>
+  </documentManagement>
+</p:properties>
+</file>
+
+<file path=customXml/item2.xml><?xml version="1.0" encoding="utf-8"?>
 <b:Sources xmlns:b="http://schemas.openxmlformats.org/officeDocument/2006/bibliography" xmlns="http://schemas.openxmlformats.org/officeDocument/2006/bibliography" SelectedStyle="/APA.XSL" StyleName="APA"/>
 </file>
 
-<file path=customXml/item2.xml><?xml version="1.0" encoding="utf-8"?>
+<file path=customXml/item3.xml><?xml version="1.0" encoding="utf-8"?>
 <?mso-contentType ?>
 <FormTemplates xmlns="http://schemas.microsoft.com/sharepoint/v3/contenttype/forms">
   <Display>DocumentLibraryForm</Display>
@@ -10271,7 +10282,7 @@
 </FormTemplates>
 </file>
 
-<file path=customXml/item3.xml><?xml version="1.0" encoding="utf-8"?>
+<file path=customXml/item4.xml><?xml version="1.0" encoding="utf-8"?>
 <ct:contentTypeSchema xmlns:ct="http://schemas.microsoft.com/office/2006/metadata/contentType" xmlns:ma="http://schemas.microsoft.com/office/2006/metadata/properties/metaAttributes" ct:_="" ma:_="" ma:contentTypeName="Document" ma:contentTypeID="0x0101003F0089FF510B58478642D29C1583046D" ma:contentTypeVersion="14" ma:contentTypeDescription="Create a new document." ma:contentTypeScope="" ma:versionID="d815bea3c975b9a3a8dee9cee3cab05e">
   <xsd:schema xmlns:xsd="http://www.w3.org/2001/XMLSchema" xmlns:xs="http://www.w3.org/2001/XMLSchema" xmlns:p="http://schemas.microsoft.com/office/2006/metadata/properties" xmlns:ns2="dd5b41f2-47a1-4d36-976d-562f279d384a" xmlns:ns3="2da6bad5-2be1-4928-81ee-00c79ada373c" targetNamespace="http://schemas.microsoft.com/office/2006/metadata/properties" ma:root="true" ma:fieldsID="c45bd8d55e1797ce0cccced8dcd0d734" ns2:_="" ns3:_="">
     <xsd:import namespace="dd5b41f2-47a1-4d36-976d-562f279d384a"/>
@@ -10500,18 +10511,18 @@
 </ct:contentTypeSchema>
 </file>
 
-<file path=customXml/item4.xml><?xml version="1.0" encoding="utf-8"?>
-<p:properties xmlns:p="http://schemas.microsoft.com/office/2006/metadata/properties" xmlns:xsi="http://www.w3.org/2001/XMLSchema-instance" xmlns:pc="http://schemas.microsoft.com/office/infopath/2007/PartnerControls">
-  <documentManagement>
-    <TaxCatchAll xmlns="2da6bad5-2be1-4928-81ee-00c79ada373c" xsi:nil="true"/>
-    <lcf76f155ced4ddcb4097134ff3c332f xmlns="dd5b41f2-47a1-4d36-976d-562f279d384a">
-      <Terms xmlns="http://schemas.microsoft.com/office/infopath/2007/PartnerControls"/>
-    </lcf76f155ced4ddcb4097134ff3c332f>
-  </documentManagement>
-</p:properties>
+<file path=customXml/itemProps1.xml><?xml version="1.0" encoding="utf-8"?>
+<ds:datastoreItem xmlns:ds="http://schemas.openxmlformats.org/officeDocument/2006/customXml" ds:itemID="{48907EF8-C8B9-4AF1-B262-64BD9CECECF2}">
+  <ds:schemaRefs>
+    <ds:schemaRef ds:uri="http://schemas.microsoft.com/office/2006/metadata/properties"/>
+    <ds:schemaRef ds:uri="http://schemas.microsoft.com/office/infopath/2007/PartnerControls"/>
+    <ds:schemaRef ds:uri="2da6bad5-2be1-4928-81ee-00c79ada373c"/>
+    <ds:schemaRef ds:uri="dd5b41f2-47a1-4d36-976d-562f279d384a"/>
+  </ds:schemaRefs>
+</ds:datastoreItem>
 </file>
 
-<file path=customXml/itemProps1.xml><?xml version="1.0" encoding="utf-8"?>
+<file path=customXml/itemProps2.xml><?xml version="1.0" encoding="utf-8"?>
 <ds:datastoreItem xmlns:ds="http://schemas.openxmlformats.org/officeDocument/2006/customXml" ds:itemID="{BC497524-F2A4-4D66-B603-2296430A3809}">
   <ds:schemaRefs>
     <ds:schemaRef ds:uri="http://schemas.openxmlformats.org/officeDocument/2006/bibliography"/>
@@ -10519,7 +10530,7 @@
 </ds:datastoreItem>
 </file>
 
-<file path=customXml/itemProps2.xml><?xml version="1.0" encoding="utf-8"?>
+<file path=customXml/itemProps3.xml><?xml version="1.0" encoding="utf-8"?>
 <ds:datastoreItem xmlns:ds="http://schemas.openxmlformats.org/officeDocument/2006/customXml" ds:itemID="{2D5F55AB-2666-429F-80AF-05E42BC3A484}">
   <ds:schemaRefs>
     <ds:schemaRef ds:uri="http://schemas.microsoft.com/sharepoint/v3/contenttype/forms"/>
@@ -10527,7 +10538,7 @@
 </ds:datastoreItem>
 </file>
 
-<file path=customXml/itemProps3.xml><?xml version="1.0" encoding="utf-8"?>
+<file path=customXml/itemProps4.xml><?xml version="1.0" encoding="utf-8"?>
 <ds:datastoreItem xmlns:ds="http://schemas.openxmlformats.org/officeDocument/2006/customXml" ds:itemID="{87382EBB-942A-4023-ACA7-0E1FDA5359AF}">
   <ds:schemaRefs>
     <ds:schemaRef ds:uri="http://schemas.microsoft.com/office/2006/metadata/contentType"/>
@@ -10544,15 +10555,4 @@
     <ds:schemaRef ds:uri="http://schemas.microsoft.com/internal/obd"/>
   </ds:schemaRefs>
 </ds:datastoreItem>
-</file>
-
-<file path=customXml/itemProps4.xml><?xml version="1.0" encoding="utf-8"?>
-<ds:datastoreItem xmlns:ds="http://schemas.openxmlformats.org/officeDocument/2006/customXml" ds:itemID="{48907EF8-C8B9-4AF1-B262-64BD9CECECF2}">
-  <ds:schemaRefs>
-    <ds:schemaRef ds:uri="http://schemas.microsoft.com/office/2006/metadata/properties"/>
-    <ds:schemaRef ds:uri="http://schemas.microsoft.com/office/infopath/2007/PartnerControls"/>
-    <ds:schemaRef ds:uri="2da6bad5-2be1-4928-81ee-00c79ada373c"/>
-    <ds:schemaRef ds:uri="dd5b41f2-47a1-4d36-976d-562f279d384a"/>
-  </ds:schemaRefs>
-</ds:datastoreItem>
 </file>
</xml_diff>